<commit_message>
fix the state_machine code and add the test banch to the folder
</commit_message>
<xml_diff>
--- a/state_machine/תמונות של state machine.docx
+++ b/state_machine/תמונות של state machine.docx
@@ -14,13 +14,100 @@
           <w:rtl/>
         </w:rPr>
         <w:drawing>
-          <wp:anchor distT="0" distB="0" distL="114300" distR="114300" simplePos="0" relativeHeight="251658240" behindDoc="1" locked="0" layoutInCell="1" allowOverlap="1" wp14:anchorId="2846F154" wp14:editId="34AA9B9F">
+          <wp:anchor distT="0" distB="0" distL="114300" distR="114300" simplePos="0" relativeHeight="251659264" behindDoc="1" locked="0" layoutInCell="1" allowOverlap="1" wp14:anchorId="6C87C002" wp14:editId="2FA8B121">
             <wp:simplePos x="0" y="0"/>
             <wp:positionH relativeFrom="page">
               <wp:align>right</wp:align>
             </wp:positionH>
             <wp:positionV relativeFrom="paragraph">
-              <wp:posOffset>198120</wp:posOffset>
+              <wp:posOffset>243840</wp:posOffset>
+            </wp:positionV>
+            <wp:extent cx="7703820" cy="990600"/>
+            <wp:effectExtent l="0" t="0" r="0" b="0"/>
+            <wp:wrapTight wrapText="bothSides">
+              <wp:wrapPolygon edited="0">
+                <wp:start x="0" y="0"/>
+                <wp:lineTo x="0" y="21185"/>
+                <wp:lineTo x="21525" y="21185"/>
+                <wp:lineTo x="21525" y="0"/>
+                <wp:lineTo x="0" y="0"/>
+              </wp:wrapPolygon>
+            </wp:wrapTight>
+            <wp:docPr id="1497777584" name="תמונה 1"/>
+            <wp:cNvGraphicFramePr>
+              <a:graphicFrameLocks xmlns:a="http://schemas.openxmlformats.org/drawingml/2006/main" noChangeAspect="1"/>
+            </wp:cNvGraphicFramePr>
+            <a:graphic xmlns:a="http://schemas.openxmlformats.org/drawingml/2006/main">
+              <a:graphicData uri="http://schemas.openxmlformats.org/drawingml/2006/picture">
+                <pic:pic xmlns:pic="http://schemas.openxmlformats.org/drawingml/2006/picture">
+                  <pic:nvPicPr>
+                    <pic:cNvPr id="1497777584" name=""/>
+                    <pic:cNvPicPr/>
+                  </pic:nvPicPr>
+                  <pic:blipFill>
+                    <a:blip r:embed="rId4">
+                      <a:extLst>
+                        <a:ext uri="{28A0092B-C50C-407E-A947-70E740481C1C}">
+                          <a14:useLocalDpi xmlns:a14="http://schemas.microsoft.com/office/drawing/2010/main" val="0"/>
+                        </a:ext>
+                      </a:extLst>
+                    </a:blip>
+                    <a:stretch>
+                      <a:fillRect/>
+                    </a:stretch>
+                  </pic:blipFill>
+                  <pic:spPr>
+                    <a:xfrm>
+                      <a:off x="0" y="0"/>
+                      <a:ext cx="7703820" cy="990600"/>
+                    </a:xfrm>
+                    <a:prstGeom prst="rect">
+                      <a:avLst/>
+                    </a:prstGeom>
+                  </pic:spPr>
+                </pic:pic>
+              </a:graphicData>
+            </a:graphic>
+            <wp14:sizeRelH relativeFrom="margin">
+              <wp14:pctWidth>0</wp14:pctWidth>
+            </wp14:sizeRelH>
+            <wp14:sizeRelV relativeFrom="margin">
+              <wp14:pctHeight>0</wp14:pctHeight>
+            </wp14:sizeRelV>
+          </wp:anchor>
+        </w:drawing>
+      </w:r>
+      <w:r>
+        <w:rPr>
+          <w:rFonts w:hint="cs"/>
+          <w:rtl/>
+        </w:rPr>
+        <w:t xml:space="preserve">תמונות של </w:t>
+      </w:r>
+      <w:r>
+        <w:t>state machine</w:t>
+      </w:r>
+    </w:p>
+    <w:p>
+      <w:pPr>
+        <w:rPr>
+          <w:rFonts w:hint="cs"/>
+        </w:rPr>
+      </w:pPr>
+      <w:r>
+        <w:rPr>
+          <w:rFonts w:cs="Arial"/>
+          <w:noProof/>
+          <w:rtl/>
+        </w:rPr>
+        <w:drawing>
+          <wp:anchor distT="0" distB="0" distL="114300" distR="114300" simplePos="0" relativeHeight="251658240" behindDoc="1" locked="0" layoutInCell="1" allowOverlap="1" wp14:anchorId="2846F154" wp14:editId="0D22A262">
+            <wp:simplePos x="0" y="0"/>
+            <wp:positionH relativeFrom="page">
+              <wp:align>right</wp:align>
+            </wp:positionH>
+            <wp:positionV relativeFrom="paragraph">
+              <wp:posOffset>1450975</wp:posOffset>
             </wp:positionV>
             <wp:extent cx="7780655" cy="571500"/>
             <wp:effectExtent l="0" t="0" r="0" b="0"/>
@@ -45,7 +132,7 @@
                     <pic:cNvPicPr/>
                   </pic:nvPicPr>
                   <pic:blipFill>
-                    <a:blip r:embed="rId4">
+                    <a:blip r:embed="rId5">
                       <a:extLst>
                         <a:ext uri="{28A0092B-C50C-407E-A947-70E740481C1C}">
                           <a14:useLocalDpi xmlns:a14="http://schemas.microsoft.com/office/drawing/2010/main" val="0"/>
@@ -77,18 +164,7 @@
           </wp:anchor>
         </w:drawing>
       </w:r>
-      <w:r>
-        <w:rPr>
-          <w:rFonts w:hint="cs"/>
-          <w:rtl/>
-        </w:rPr>
-        <w:t xml:space="preserve">תמונות של </w:t>
-      </w:r>
-      <w:r>
-        <w:t>state machine</w:t>
-      </w:r>
     </w:p>
-    <w:p/>
     <w:sectPr>
       <w:pgSz w:w="11906" w:h="16838"/>
       <w:pgMar w:top="1440" w:right="1800" w:bottom="1440" w:left="1800" w:header="708" w:footer="708" w:gutter="0"/>

</xml_diff>